<commit_message>
Add PS on exercise naming scheme
</commit_message>
<xml_diff>
--- a/IoT-and-Digitalization-for-the-Circular-Economy/Exercises/E02-LCA-Part-1.docx
+++ b/IoT-and-Digitalization-for-the-Circular-Economy/Exercises/E02-LCA-Part-1.docx
@@ -22,7 +22,7 @@
         <mc:AlternateContent>
           <mc:Choice Requires="wpg">
             <w:drawing>
-              <wp:anchor distT="0" distB="3175" distL="0" distR="0" simplePos="0" relativeHeight="5" behindDoc="1" locked="0" layoutInCell="0" allowOverlap="1" wp14:anchorId="403E3148">
+              <wp:anchor distT="0" distB="3175" distL="0" distR="0" simplePos="0" relativeHeight="7" behindDoc="1" locked="0" layoutInCell="0" allowOverlap="1" wp14:anchorId="403E3148">
                 <wp:simplePos x="0" y="0"/>
                 <wp:positionH relativeFrom="page">
                   <wp:posOffset>2438400</wp:posOffset>
@@ -59,16 +59,16 @@
                           <wps:cNvSpPr/>
                           <wps:spPr>
                             <a:xfrm>
-                              <a:off x="4866120" y="0"/>
-                              <a:ext cx="519480" cy="11593080"/>
+                              <a:off x="4866480" y="0"/>
+                              <a:ext cx="518760" cy="11593080"/>
                             </a:xfrm>
                             <a:custGeom>
                               <a:avLst/>
                               <a:gdLst>
-                                <a:gd name="textAreaLeft" fmla="*/ 0 w 294480"/>
-                                <a:gd name="textAreaRight" fmla="*/ 298080 w 294480"/>
+                                <a:gd name="textAreaLeft" fmla="*/ 0 w 294120"/>
+                                <a:gd name="textAreaRight" fmla="*/ 298080 w 294120"/>
                                 <a:gd name="textAreaTop" fmla="*/ 0 h 6572520"/>
-                                <a:gd name="textAreaBottom" fmla="*/ 6576120 h 6572520"/>
+                                <a:gd name="textAreaBottom" fmla="*/ 6576480 h 6572520"/>
                               </a:gdLst>
                               <a:ahLst/>
                               <a:cxnLst/>
@@ -180,16 +180,7 @@
           <w:szCs w:val="44"/>
           <w:lang w:val="de-DE" w:eastAsia="de-DE"/>
         </w:rPr>
-        <w:t xml:space="preserve">Exercise – </w:t>
-      </w:r>
-      <w:r>
-        <w:rPr>
-          <w:rFonts w:ascii="StoneSansITCStd SemiBold" w:hAnsi="StoneSansITCStd SemiBold"/>
-          <w:sz w:val="44"/>
-          <w:szCs w:val="44"/>
-          <w:lang w:val="de-DE" w:eastAsia="de-DE"/>
-        </w:rPr>
-        <w:t>2</w:t>
+        <w:t>Exercise – 2</w:t>
       </w:r>
     </w:p>
     <w:p>
@@ -733,6 +724,31 @@
     <w:p>
       <w:pPr>
         <w:pStyle w:val="Normal"/>
+        <w:numPr>
+          <w:ilvl w:val="0"/>
+          <w:numId w:val="0"/>
+        </w:numPr>
+        <w:tabs>
+          <w:tab w:val="clear" w:pos="720"/>
+          <w:tab w:val="left" w:pos="567" w:leader="none"/>
+        </w:tabs>
+        <w:spacing w:lineRule="exact" w:line="340" w:before="0" w:after="120"/>
+        <w:ind w:hanging="0" w:left="1440"/>
+        <w:jc w:val="left"/>
+        <w:rPr>
+          <w:lang w:val="de-DE" w:eastAsia="de-DE"/>
+        </w:rPr>
+      </w:pPr>
+      <w:r>
+        <w:rPr>
+          <w:lang w:val="de-DE" w:eastAsia="de-DE"/>
+        </w:rPr>
+        <w:t>PS: The exercise on cocalc might be named (E03), but it still refers to this exercise, so please do not be alarmed.</w:t>
+      </w:r>
+    </w:p>
+    <w:p>
+      <w:pPr>
+        <w:pStyle w:val="Normal"/>
         <w:tabs>
           <w:tab w:val="clear" w:pos="720"/>
           <w:tab w:val="left" w:pos="567" w:leader="none"/>
@@ -776,25 +792,7 @@
             <w:bCs/>
             <w:lang w:val="de-DE"/>
           </w:rPr>
-          <w:t>etce-</w:t>
-        </w:r>
-        <w:r>
-          <w:rPr>
-            <w:rStyle w:val="Hyperlink"/>
-            <w:b/>
-            <w:bCs/>
-            <w:lang w:val="de-DE"/>
-          </w:rPr>
-          <w:t>etce</w:t>
-        </w:r>
-        <w:r>
-          <w:rPr>
-            <w:rStyle w:val="Hyperlink"/>
-            <w:b/>
-            <w:bCs/>
-            <w:lang w:val="de-DE"/>
-          </w:rPr>
-          <w:t>@tu-clausthal.de</w:t>
+          <w:t>etce-etce@tu-clausthal.de</w:t>
         </w:r>
       </w:hyperlink>
     </w:p>
@@ -1033,7 +1031,7 @@
         </mc:Fallback>
       </mc:AlternateContent>
       <w:drawing>
-        <wp:anchor distT="0" distB="0" distL="0" distR="0" simplePos="0" relativeHeight="0" behindDoc="1" locked="0" layoutInCell="1" allowOverlap="1">
+        <wp:anchor distT="0" distB="0" distL="0" distR="0" simplePos="0" relativeHeight="5" behindDoc="1" locked="0" layoutInCell="1" allowOverlap="1">
           <wp:simplePos x="0" y="0"/>
           <wp:positionH relativeFrom="column">
             <wp:posOffset>635</wp:posOffset>
@@ -1071,6 +1069,7 @@
                   <a:prstGeom prst="rect">
                     <a:avLst/>
                   </a:prstGeom>
+                  <a:noFill/>
                 </pic:spPr>
               </pic:pic>
             </a:graphicData>
@@ -1093,7 +1092,7 @@
     <w:r>
       <w:rPr/>
       <w:drawing>
-        <wp:anchor distT="0" distB="0" distL="0" distR="0" simplePos="0" relativeHeight="3" behindDoc="1" locked="0" layoutInCell="1" allowOverlap="1">
+        <wp:anchor distT="0" distB="0" distL="0" distR="0" simplePos="0" relativeHeight="4" behindDoc="1" locked="0" layoutInCell="1" allowOverlap="1">
           <wp:simplePos x="0" y="0"/>
           <wp:positionH relativeFrom="column">
             <wp:posOffset>-540385</wp:posOffset>
@@ -1175,7 +1174,7 @@
         <w:b/>
       </w:rPr>
       <w:drawing>
-        <wp:anchor distT="0" distB="0" distL="114300" distR="114300" simplePos="0" relativeHeight="0" behindDoc="0" locked="0" layoutInCell="1" allowOverlap="1">
+        <wp:anchor distT="0" distB="0" distL="114300" distR="114300" simplePos="0" relativeHeight="8" behindDoc="0" locked="0" layoutInCell="0" allowOverlap="1">
           <wp:simplePos x="0" y="0"/>
           <wp:positionH relativeFrom="column">
             <wp:posOffset>3967480</wp:posOffset>
@@ -1187,13 +1186,13 @@
           <wp:effectExtent l="0" t="0" r="0" b="0"/>
           <wp:wrapTight wrapText="bothSides">
             <wp:wrapPolygon edited="0">
-              <wp:start x="-34" y="0"/>
-              <wp:lineTo x="-34" y="20759"/>
+              <wp:start x="-38" y="0"/>
+              <wp:lineTo x="-38" y="20759"/>
               <wp:lineTo x="21460" y="20759"/>
               <wp:lineTo x="21460" y="8916"/>
-              <wp:lineTo x="4100" y="8916"/>
-              <wp:lineTo x="4100" y="0"/>
-              <wp:lineTo x="-34" y="0"/>
+              <wp:lineTo x="4095" y="8916"/>
+              <wp:lineTo x="4095" y="0"/>
+              <wp:lineTo x="-38" y="0"/>
             </wp:wrapPolygon>
           </wp:wrapTight>
           <wp:docPr id="4" name="Picture 5"/>
@@ -1223,6 +1222,7 @@
                   <a:prstGeom prst="rect">
                     <a:avLst/>
                   </a:prstGeom>
+                  <a:noFill/>
                 </pic:spPr>
               </pic:pic>
             </a:graphicData>
@@ -1248,7 +1248,7 @@
     <w:r>
       <w:rPr/>
       <w:drawing>
-        <wp:anchor distT="0" distB="0" distL="0" distR="114300" simplePos="0" relativeHeight="4" behindDoc="0" locked="0" layoutInCell="0" allowOverlap="1">
+        <wp:anchor distT="0" distB="0" distL="0" distR="114300" simplePos="0" relativeHeight="6" behindDoc="0" locked="0" layoutInCell="0" allowOverlap="1">
           <wp:simplePos x="0" y="0"/>
           <wp:positionH relativeFrom="page">
             <wp:align>left</wp:align>
@@ -1260,13 +1260,13 @@
           <wp:effectExtent l="0" t="0" r="0" b="0"/>
           <wp:wrapTight wrapText="bothSides">
             <wp:wrapPolygon edited="0">
-              <wp:start x="-34" y="0"/>
-              <wp:lineTo x="-34" y="21061"/>
+              <wp:start x="-38" y="0"/>
+              <wp:lineTo x="-38" y="21061"/>
               <wp:lineTo x="21486" y="21061"/>
               <wp:lineTo x="21486" y="9334"/>
-              <wp:lineTo x="4100" y="7081"/>
-              <wp:lineTo x="4100" y="0"/>
-              <wp:lineTo x="-34" y="0"/>
+              <wp:lineTo x="4095" y="7081"/>
+              <wp:lineTo x="4095" y="0"/>
+              <wp:lineTo x="-38" y="0"/>
             </wp:wrapPolygon>
           </wp:wrapTight>
           <wp:docPr id="5" name="Picture 469"/>
@@ -2380,19 +2380,19 @@
       <w:szCs w:val="20"/>
     </w:rPr>
   </w:style>
+  <w:style w:type="character" w:styleId="EndnoteCharactersuser">
+    <w:name w:val="Endnote Characters (user)"/>
+    <w:uiPriority w:val="99"/>
+    <w:semiHidden/>
+    <w:unhideWhenUsed/>
+    <w:qFormat/>
+    <w:rsid w:val="004d5a25"/>
+    <w:rPr>
+      <w:vertAlign w:val="superscript"/>
+    </w:rPr>
+  </w:style>
   <w:style w:type="character" w:styleId="EndnoteCharacters">
     <w:name w:val="Endnote Characters"/>
-    <w:uiPriority w:val="99"/>
-    <w:semiHidden/>
-    <w:unhideWhenUsed/>
-    <w:qFormat/>
-    <w:rsid w:val="004d5a25"/>
-    <w:rPr>
-      <w:vertAlign w:val="superscript"/>
-    </w:rPr>
-  </w:style>
-  <w:style w:type="character" w:styleId="EndnoteCharactersuser">
-    <w:name w:val="Endnote Characters (user)"/>
     <w:qFormat/>
     <w:rPr>
       <w:vertAlign w:val="superscript"/>
@@ -2416,18 +2416,18 @@
       <w:szCs w:val="20"/>
     </w:rPr>
   </w:style>
+  <w:style w:type="character" w:styleId="FootnoteCharactersuser">
+    <w:name w:val="Footnote Characters (user)"/>
+    <w:uiPriority w:val="99"/>
+    <w:unhideWhenUsed/>
+    <w:qFormat/>
+    <w:rsid w:val="004d5a25"/>
+    <w:rPr>
+      <w:vertAlign w:val="superscript"/>
+    </w:rPr>
+  </w:style>
   <w:style w:type="character" w:styleId="FootnoteCharacters">
     <w:name w:val="Footnote Characters"/>
-    <w:uiPriority w:val="99"/>
-    <w:unhideWhenUsed/>
-    <w:qFormat/>
-    <w:rsid w:val="004d5a25"/>
-    <w:rPr>
-      <w:vertAlign w:val="superscript"/>
-    </w:rPr>
-  </w:style>
-  <w:style w:type="character" w:styleId="FootnoteCharactersuser">
-    <w:name w:val="Footnote Characters (user)"/>
     <w:qFormat/>
     <w:rPr>
       <w:vertAlign w:val="superscript"/>
@@ -2609,8 +2609,8 @@
       <w:lang w:eastAsia="de-DE"/>
     </w:rPr>
   </w:style>
-  <w:style w:type="character" w:styleId="Bullets">
-    <w:name w:val="Bullets"/>
+  <w:style w:type="character" w:styleId="Bulletsuser">
+    <w:name w:val="Bullets (user)"/>
     <w:qFormat/>
     <w:rPr>
       <w:rFonts w:ascii="OpenSymbol" w:hAnsi="OpenSymbol" w:eastAsia="OpenSymbol" w:cs="OpenSymbol"/>
@@ -3171,15 +3171,15 @@
       <w:lang w:eastAsia="de-DE"/>
     </w:rPr>
   </w:style>
+  <w:style w:type="paragraph" w:styleId="FrameContentsuser">
+    <w:name w:val="Frame Contents (user)"/>
+    <w:basedOn w:val="Normal"/>
+    <w:qFormat/>
+    <w:pPr/>
+    <w:rPr/>
+  </w:style>
   <w:style w:type="paragraph" w:styleId="FrameContents">
     <w:name w:val="Frame Contents"/>
-    <w:basedOn w:val="Normal"/>
-    <w:qFormat/>
-    <w:pPr/>
-    <w:rPr/>
-  </w:style>
-  <w:style w:type="paragraph" w:styleId="FrameContentsuser">
-    <w:name w:val="Frame Contents (user)"/>
     <w:basedOn w:val="Normal"/>
     <w:qFormat/>
     <w:pPr/>

</xml_diff>

<commit_message>
* updated IoT course
</commit_message>
<xml_diff>
--- a/IoT-and-Digitalization-for-the-Circular-Economy/Exercises/E02-LCA-Part-1.docx
+++ b/IoT-and-Digitalization-for-the-Circular-Economy/Exercises/E02-LCA-Part-1.docx
@@ -22,7 +22,7 @@
         <mc:AlternateContent>
           <mc:Choice Requires="wpg">
             <w:drawing>
-              <wp:anchor distT="0" distB="3175" distL="0" distR="0" simplePos="0" relativeHeight="7" behindDoc="1" locked="0" layoutInCell="0" allowOverlap="1" wp14:anchorId="403E3148">
+              <wp:anchor distT="0" distB="3175" distL="0" distR="0" simplePos="0" relativeHeight="5" behindDoc="1" locked="0" layoutInCell="0" allowOverlap="1" wp14:anchorId="403E3148">
                 <wp:simplePos x="0" y="0"/>
                 <wp:positionH relativeFrom="page">
                   <wp:posOffset>2438400</wp:posOffset>
@@ -59,16 +59,16 @@
                           <wps:cNvSpPr/>
                           <wps:spPr>
                             <a:xfrm>
-                              <a:off x="4866480" y="0"/>
-                              <a:ext cx="518760" cy="11593080"/>
+                              <a:off x="4867200" y="0"/>
+                              <a:ext cx="518040" cy="11593080"/>
                             </a:xfrm>
                             <a:custGeom>
                               <a:avLst/>
                               <a:gdLst>
-                                <a:gd name="textAreaLeft" fmla="*/ 0 w 294120"/>
-                                <a:gd name="textAreaRight" fmla="*/ 298080 w 294120"/>
+                                <a:gd name="textAreaLeft" fmla="*/ 0 w 293760"/>
+                                <a:gd name="textAreaRight" fmla="*/ 298080 w 293760"/>
                                 <a:gd name="textAreaTop" fmla="*/ 0 h 6572520"/>
-                                <a:gd name="textAreaBottom" fmla="*/ 6576480 h 6572520"/>
+                                <a:gd name="textAreaBottom" fmla="*/ 6576840 h 6572520"/>
                               </a:gdLst>
                               <a:ahLst/>
                               <a:cxnLst/>
@@ -94,7 +94,7 @@
                               </a:pathLst>
                             </a:custGeom>
                             <a:solidFill>
-                              <a:srgbClr val="E4E4E4"/>
+                              <a:srgbClr val="e4e4e4"/>
                             </a:solidFill>
                             <a:ln w="0">
                               <a:noFill/>
@@ -792,28 +792,27 @@
             <w:bCs/>
             <w:lang w:val="de-DE"/>
           </w:rPr>
-          <w:t>etce-etce@tu-clausthal.de</w:t>
+          <w:t>etce-</w:t>
+        </w:r>
+        <w:r>
+          <w:rPr>
+            <w:rStyle w:val="Hyperlink"/>
+            <w:b/>
+            <w:bCs/>
+            <w:lang w:val="de-DE"/>
+          </w:rPr>
+          <w:t>iot</w:t>
+        </w:r>
+        <w:r>
+          <w:rPr>
+            <w:rStyle w:val="Hyperlink"/>
+            <w:b/>
+            <w:bCs/>
+            <w:lang w:val="de-DE"/>
+          </w:rPr>
+          <w:t>@tu-clausthal.de</w:t>
         </w:r>
       </w:hyperlink>
-    </w:p>
-    <w:p>
-      <w:pPr>
-        <w:pStyle w:val="Normal"/>
-        <w:tabs>
-          <w:tab w:val="clear" w:pos="720"/>
-          <w:tab w:val="left" w:pos="567" w:leader="none"/>
-        </w:tabs>
-        <w:spacing w:lineRule="auto" w:line="300"/>
-        <w:ind w:hanging="0" w:left="720"/>
-        <w:rPr>
-          <w:lang w:val="de-DE"/>
-        </w:rPr>
-      </w:pPr>
-      <w:r>
-        <w:rPr>
-          <w:lang w:val="de-DE"/>
-        </w:rPr>
-      </w:r>
     </w:p>
     <w:p>
       <w:pPr>
@@ -965,7 +964,7 @@
                         </w:p>
                       </w:txbxContent>
                     </wps:txbx>
-                    <wps:bodyPr lIns="0" tIns="0" rIns="0" bIns="0" anchor="t">
+                    <wps:bodyPr lIns="0" rIns="0" tIns="0" bIns="0" anchor="t">
                       <a:spAutoFit/>
                     </wps:bodyPr>
                   </wps:wsp>
@@ -1031,7 +1030,7 @@
         </mc:Fallback>
       </mc:AlternateContent>
       <w:drawing>
-        <wp:anchor distT="0" distB="0" distL="0" distR="0" simplePos="0" relativeHeight="5" behindDoc="1" locked="0" layoutInCell="1" allowOverlap="1">
+        <wp:anchor distT="0" distB="0" distL="0" distR="0" simplePos="0" relativeHeight="0" behindDoc="1" locked="0" layoutInCell="1" allowOverlap="1">
           <wp:simplePos x="0" y="0"/>
           <wp:positionH relativeFrom="column">
             <wp:posOffset>635</wp:posOffset>
@@ -1069,7 +1068,6 @@
                   <a:prstGeom prst="rect">
                     <a:avLst/>
                   </a:prstGeom>
-                  <a:noFill/>
                 </pic:spPr>
               </pic:pic>
             </a:graphicData>
@@ -1092,7 +1090,7 @@
     <w:r>
       <w:rPr/>
       <w:drawing>
-        <wp:anchor distT="0" distB="0" distL="0" distR="0" simplePos="0" relativeHeight="4" behindDoc="1" locked="0" layoutInCell="1" allowOverlap="1">
+        <wp:anchor distT="0" distB="0" distL="0" distR="0" simplePos="0" relativeHeight="3" behindDoc="1" locked="0" layoutInCell="1" allowOverlap="1">
           <wp:simplePos x="0" y="0"/>
           <wp:positionH relativeFrom="column">
             <wp:posOffset>-540385</wp:posOffset>
@@ -1174,7 +1172,7 @@
         <w:b/>
       </w:rPr>
       <w:drawing>
-        <wp:anchor distT="0" distB="0" distL="114300" distR="114300" simplePos="0" relativeHeight="8" behindDoc="0" locked="0" layoutInCell="0" allowOverlap="1">
+        <wp:anchor distT="0" distB="0" distL="114300" distR="114300" simplePos="0" relativeHeight="0" behindDoc="0" locked="0" layoutInCell="1" allowOverlap="1">
           <wp:simplePos x="0" y="0"/>
           <wp:positionH relativeFrom="column">
             <wp:posOffset>3967480</wp:posOffset>
@@ -1186,13 +1184,13 @@
           <wp:effectExtent l="0" t="0" r="0" b="0"/>
           <wp:wrapTight wrapText="bothSides">
             <wp:wrapPolygon edited="0">
-              <wp:start x="-38" y="0"/>
-              <wp:lineTo x="-38" y="20759"/>
+              <wp:start x="-42" y="0"/>
+              <wp:lineTo x="-42" y="20759"/>
               <wp:lineTo x="21460" y="20759"/>
               <wp:lineTo x="21460" y="8916"/>
-              <wp:lineTo x="4095" y="8916"/>
-              <wp:lineTo x="4095" y="0"/>
-              <wp:lineTo x="-38" y="0"/>
+              <wp:lineTo x="4091" y="8916"/>
+              <wp:lineTo x="4091" y="0"/>
+              <wp:lineTo x="-42" y="0"/>
             </wp:wrapPolygon>
           </wp:wrapTight>
           <wp:docPr id="4" name="Picture 5"/>
@@ -1222,7 +1220,6 @@
                   <a:prstGeom prst="rect">
                     <a:avLst/>
                   </a:prstGeom>
-                  <a:noFill/>
                 </pic:spPr>
               </pic:pic>
             </a:graphicData>
@@ -1241,6 +1238,7 @@
       <w:pStyle w:val="Header"/>
       <w:tabs>
         <w:tab w:val="clear" w:pos="4703"/>
+        <w:tab w:val="right" w:pos="9406" w:leader="none"/>
       </w:tabs>
       <w:spacing w:before="120" w:after="0"/>
       <w:rPr/>
@@ -1248,7 +1246,7 @@
     <w:r>
       <w:rPr/>
       <w:drawing>
-        <wp:anchor distT="0" distB="0" distL="0" distR="114300" simplePos="0" relativeHeight="6" behindDoc="0" locked="0" layoutInCell="0" allowOverlap="1">
+        <wp:anchor distT="0" distB="0" distL="0" distR="114300" simplePos="0" relativeHeight="4" behindDoc="0" locked="0" layoutInCell="0" allowOverlap="1">
           <wp:simplePos x="0" y="0"/>
           <wp:positionH relativeFrom="page">
             <wp:align>left</wp:align>
@@ -1260,13 +1258,13 @@
           <wp:effectExtent l="0" t="0" r="0" b="0"/>
           <wp:wrapTight wrapText="bothSides">
             <wp:wrapPolygon edited="0">
-              <wp:start x="-38" y="0"/>
-              <wp:lineTo x="-38" y="21061"/>
+              <wp:start x="-42" y="0"/>
+              <wp:lineTo x="-42" y="21061"/>
               <wp:lineTo x="21486" y="21061"/>
               <wp:lineTo x="21486" y="9334"/>
-              <wp:lineTo x="4095" y="7081"/>
-              <wp:lineTo x="4095" y="0"/>
-              <wp:lineTo x="-38" y="0"/>
+              <wp:lineTo x="4091" y="7081"/>
+              <wp:lineTo x="4091" y="0"/>
+              <wp:lineTo x="-42" y="0"/>
             </wp:wrapPolygon>
           </wp:wrapTight>
           <wp:docPr id="5" name="Picture 469"/>
@@ -2380,19 +2378,19 @@
       <w:szCs w:val="20"/>
     </w:rPr>
   </w:style>
+  <w:style w:type="character" w:styleId="EndnoteCharacters">
+    <w:name w:val="Endnote Characters"/>
+    <w:uiPriority w:val="99"/>
+    <w:semiHidden/>
+    <w:unhideWhenUsed/>
+    <w:qFormat/>
+    <w:rsid w:val="004d5a25"/>
+    <w:rPr>
+      <w:vertAlign w:val="superscript"/>
+    </w:rPr>
+  </w:style>
   <w:style w:type="character" w:styleId="EndnoteCharactersuser">
     <w:name w:val="Endnote Characters (user)"/>
-    <w:uiPriority w:val="99"/>
-    <w:semiHidden/>
-    <w:unhideWhenUsed/>
-    <w:qFormat/>
-    <w:rsid w:val="004d5a25"/>
-    <w:rPr>
-      <w:vertAlign w:val="superscript"/>
-    </w:rPr>
-  </w:style>
-  <w:style w:type="character" w:styleId="EndnoteCharacters">
-    <w:name w:val="Endnote Characters"/>
     <w:qFormat/>
     <w:rPr>
       <w:vertAlign w:val="superscript"/>
@@ -2416,18 +2414,18 @@
       <w:szCs w:val="20"/>
     </w:rPr>
   </w:style>
+  <w:style w:type="character" w:styleId="FootnoteCharacters">
+    <w:name w:val="Footnote Characters"/>
+    <w:uiPriority w:val="99"/>
+    <w:unhideWhenUsed/>
+    <w:qFormat/>
+    <w:rsid w:val="004d5a25"/>
+    <w:rPr>
+      <w:vertAlign w:val="superscript"/>
+    </w:rPr>
+  </w:style>
   <w:style w:type="character" w:styleId="FootnoteCharactersuser">
     <w:name w:val="Footnote Characters (user)"/>
-    <w:uiPriority w:val="99"/>
-    <w:unhideWhenUsed/>
-    <w:qFormat/>
-    <w:rsid w:val="004d5a25"/>
-    <w:rPr>
-      <w:vertAlign w:val="superscript"/>
-    </w:rPr>
-  </w:style>
-  <w:style w:type="character" w:styleId="FootnoteCharacters">
-    <w:name w:val="Footnote Characters"/>
     <w:qFormat/>
     <w:rPr>
       <w:vertAlign w:val="superscript"/>
@@ -2609,8 +2607,8 @@
       <w:lang w:eastAsia="de-DE"/>
     </w:rPr>
   </w:style>
-  <w:style w:type="character" w:styleId="Bulletsuser">
-    <w:name w:val="Bullets (user)"/>
+  <w:style w:type="character" w:styleId="Bullets">
+    <w:name w:val="Bullets"/>
     <w:qFormat/>
     <w:rPr>
       <w:rFonts w:ascii="OpenSymbol" w:hAnsi="OpenSymbol" w:eastAsia="OpenSymbol" w:cs="OpenSymbol"/>
@@ -3171,15 +3169,15 @@
       <w:lang w:eastAsia="de-DE"/>
     </w:rPr>
   </w:style>
+  <w:style w:type="paragraph" w:styleId="FrameContents">
+    <w:name w:val="Frame Contents"/>
+    <w:basedOn w:val="Normal"/>
+    <w:qFormat/>
+    <w:pPr/>
+    <w:rPr/>
+  </w:style>
   <w:style w:type="paragraph" w:styleId="FrameContentsuser">
     <w:name w:val="Frame Contents (user)"/>
-    <w:basedOn w:val="Normal"/>
-    <w:qFormat/>
-    <w:pPr/>
-    <w:rPr/>
-  </w:style>
-  <w:style w:type="paragraph" w:styleId="FrameContents">
-    <w:name w:val="Frame Contents"/>
     <w:basedOn w:val="Normal"/>
     <w:qFormat/>
     <w:pPr/>
@@ -3249,34 +3247,34 @@
         <a:srgbClr val="000000"/>
       </a:dk1>
       <a:lt1>
-        <a:srgbClr val="FFFFFF"/>
+        <a:srgbClr val="ffffff"/>
       </a:lt1>
       <a:dk2>
-        <a:srgbClr val="1F497D"/>
+        <a:srgbClr val="1f497d"/>
       </a:dk2>
       <a:lt2>
-        <a:srgbClr val="EEECE1"/>
+        <a:srgbClr val="eeece1"/>
       </a:lt2>
       <a:accent1>
-        <a:srgbClr val="4F81BD"/>
+        <a:srgbClr val="4f81bd"/>
       </a:accent1>
       <a:accent2>
-        <a:srgbClr val="C0504D"/>
+        <a:srgbClr val="c0504d"/>
       </a:accent2>
       <a:accent3>
-        <a:srgbClr val="9BBB59"/>
+        <a:srgbClr val="9bbb59"/>
       </a:accent3>
       <a:accent4>
-        <a:srgbClr val="8064A2"/>
+        <a:srgbClr val="8064a2"/>
       </a:accent4>
       <a:accent5>
-        <a:srgbClr val="4BACC6"/>
+        <a:srgbClr val="4bacc6"/>
       </a:accent5>
       <a:accent6>
-        <a:srgbClr val="F79646"/>
+        <a:srgbClr val="f79646"/>
       </a:accent6>
       <a:hlink>
-        <a:srgbClr val="0000FF"/>
+        <a:srgbClr val="0000ff"/>
       </a:hlink>
       <a:folHlink>
         <a:srgbClr val="800080"/>

</xml_diff>